<commit_message>
added the document and files that has the graphs of the FFT team validation
</commit_message>
<xml_diff>
--- a/SAMV71x/project_FFT/Project_FFT.docx
+++ b/SAMV71x/project_FFT/Project_FFT.docx
@@ -10,7 +10,6 @@
           <w:bCs/>
           <w:sz w:val="28"/>
           <w:szCs w:val="28"/>
-          <w:lang w:val="en-US"/>
         </w:rPr>
       </w:pPr>
       <w:r>
@@ -19,18 +18,11 @@
           <w:bCs/>
           <w:sz w:val="28"/>
           <w:szCs w:val="28"/>
-          <w:lang w:val="en-US"/>
         </w:rPr>
         <w:t>Project 6 Frequency analysis from captured audio</w:t>
       </w:r>
     </w:p>
-    <w:p>
-      <w:pPr>
-        <w:rPr>
-          <w:lang w:val="en-US"/>
-        </w:rPr>
-      </w:pPr>
-    </w:p>
+    <w:p/>
     <w:p>
       <w:pPr>
         <w:pStyle w:val="Prrafodelista"/>
@@ -58,8 +50,503 @@
     <w:p/>
     <w:p/>
     <w:p>
-      <w:r>
-        <w:t>1kHz frequency</w:t>
+      <w:pPr>
+        <w:rPr>
+          <w:b/>
+          <w:bCs/>
+          <w:sz w:val="24"/>
+          <w:szCs w:val="24"/>
+        </w:rPr>
+      </w:pPr>
+      <w:r>
+        <w:rPr>
+          <w:b/>
+          <w:bCs/>
+          <w:sz w:val="24"/>
+          <w:szCs w:val="24"/>
+        </w:rPr>
+        <w:t xml:space="preserve">1kHz </w:t>
+      </w:r>
+      <w:r>
+        <w:rPr>
+          <w:b/>
+          <w:bCs/>
+          <w:sz w:val="24"/>
+          <w:szCs w:val="24"/>
+        </w:rPr>
+        <w:t>sine wave test</w:t>
+      </w:r>
+    </w:p>
+    <w:p>
+      <w:r>
+        <w:t>-Audio captured from CODEC:</w:t>
+      </w:r>
+    </w:p>
+    <w:p>
+      <w:r>
+        <w:rPr>
+          <w:noProof/>
+        </w:rPr>
+        <w:drawing>
+          <wp:inline distT="0" distB="0" distL="0" distR="0" wp14:anchorId="4E676D1C" wp14:editId="4F60AD00">
+            <wp:extent cx="6050943" cy="2801591"/>
+            <wp:effectExtent l="0" t="0" r="6985" b="0"/>
+            <wp:docPr id="1249162922" name="Imagen 1" descr="Interfaz de usuario gráfica, Aplicación&#10;&#10;El contenido generado por IA puede ser incorrecto."/>
+            <wp:cNvGraphicFramePr>
+              <a:graphicFrameLocks xmlns:a="http://schemas.openxmlformats.org/drawingml/2006/main" noChangeAspect="1"/>
+            </wp:cNvGraphicFramePr>
+            <a:graphic xmlns:a="http://schemas.openxmlformats.org/drawingml/2006/main">
+              <a:graphicData uri="http://schemas.openxmlformats.org/drawingml/2006/picture">
+                <pic:pic xmlns:pic="http://schemas.openxmlformats.org/drawingml/2006/picture">
+                  <pic:nvPicPr>
+                    <pic:cNvPr id="1249162922" name="Imagen 1" descr="Interfaz de usuario gráfica, Aplicación&#10;&#10;El contenido generado por IA puede ser incorrecto."/>
+                    <pic:cNvPicPr/>
+                  </pic:nvPicPr>
+                  <pic:blipFill>
+                    <a:blip r:embed="rId5"/>
+                    <a:stretch>
+                      <a:fillRect/>
+                    </a:stretch>
+                  </pic:blipFill>
+                  <pic:spPr>
+                    <a:xfrm>
+                      <a:off x="0" y="0"/>
+                      <a:ext cx="6058478" cy="2805080"/>
+                    </a:xfrm>
+                    <a:prstGeom prst="rect">
+                      <a:avLst/>
+                    </a:prstGeom>
+                  </pic:spPr>
+                </pic:pic>
+              </a:graphicData>
+            </a:graphic>
+          </wp:inline>
+        </w:drawing>
+      </w:r>
+    </w:p>
+    <w:p/>
+    <w:p>
+      <w:r>
+        <w:t>-FFT process:</w:t>
+      </w:r>
+    </w:p>
+    <w:p>
+      <w:r>
+        <w:rPr>
+          <w:noProof/>
+        </w:rPr>
+        <w:lastRenderedPageBreak/>
+        <w:drawing>
+          <wp:inline distT="0" distB="0" distL="0" distR="0" wp14:anchorId="4323E88F" wp14:editId="03672C57">
+            <wp:extent cx="6020263" cy="3427013"/>
+            <wp:effectExtent l="0" t="0" r="0" b="2540"/>
+            <wp:docPr id="820393914" name="Imagen 1" descr="Gráfico&#10;&#10;El contenido generado por IA puede ser incorrecto."/>
+            <wp:cNvGraphicFramePr>
+              <a:graphicFrameLocks xmlns:a="http://schemas.openxmlformats.org/drawingml/2006/main" noChangeAspect="1"/>
+            </wp:cNvGraphicFramePr>
+            <a:graphic xmlns:a="http://schemas.openxmlformats.org/drawingml/2006/main">
+              <a:graphicData uri="http://schemas.openxmlformats.org/drawingml/2006/picture">
+                <pic:pic xmlns:pic="http://schemas.openxmlformats.org/drawingml/2006/picture">
+                  <pic:nvPicPr>
+                    <pic:cNvPr id="820393914" name="Imagen 1" descr="Gráfico&#10;&#10;El contenido generado por IA puede ser incorrecto."/>
+                    <pic:cNvPicPr/>
+                  </pic:nvPicPr>
+                  <pic:blipFill>
+                    <a:blip r:embed="rId6"/>
+                    <a:stretch>
+                      <a:fillRect/>
+                    </a:stretch>
+                  </pic:blipFill>
+                  <pic:spPr>
+                    <a:xfrm>
+                      <a:off x="0" y="0"/>
+                      <a:ext cx="6025908" cy="3430227"/>
+                    </a:xfrm>
+                    <a:prstGeom prst="rect">
+                      <a:avLst/>
+                    </a:prstGeom>
+                  </pic:spPr>
+                </pic:pic>
+              </a:graphicData>
+            </a:graphic>
+          </wp:inline>
+        </w:drawing>
+      </w:r>
+    </w:p>
+    <w:p/>
+    <w:p/>
+    <w:p/>
+    <w:p>
+      <w:pPr>
+        <w:rPr>
+          <w:b/>
+          <w:bCs/>
+          <w:sz w:val="24"/>
+          <w:szCs w:val="24"/>
+        </w:rPr>
+      </w:pPr>
+      <w:r>
+        <w:rPr>
+          <w:b/>
+          <w:bCs/>
+          <w:sz w:val="24"/>
+          <w:szCs w:val="24"/>
+        </w:rPr>
+        <w:t>2.5</w:t>
+      </w:r>
+      <w:r>
+        <w:rPr>
+          <w:b/>
+          <w:bCs/>
+          <w:sz w:val="24"/>
+          <w:szCs w:val="24"/>
+        </w:rPr>
+        <w:t>kHz sine wave test</w:t>
+      </w:r>
+    </w:p>
+    <w:p>
+      <w:r>
+        <w:t>-Audio captured from CODEC:</w:t>
+      </w:r>
+    </w:p>
+    <w:p>
+      <w:r>
+        <w:rPr>
+          <w:noProof/>
+        </w:rPr>
+        <w:drawing>
+          <wp:inline distT="0" distB="0" distL="0" distR="0" wp14:anchorId="4993D261" wp14:editId="29E49D96">
+            <wp:extent cx="5907820" cy="2760058"/>
+            <wp:effectExtent l="0" t="0" r="0" b="2540"/>
+            <wp:docPr id="1698279486" name="Imagen 1" descr="Interfaz de usuario gráfica&#10;&#10;El contenido generado por IA puede ser incorrecto."/>
+            <wp:cNvGraphicFramePr>
+              <a:graphicFrameLocks xmlns:a="http://schemas.openxmlformats.org/drawingml/2006/main" noChangeAspect="1"/>
+            </wp:cNvGraphicFramePr>
+            <a:graphic xmlns:a="http://schemas.openxmlformats.org/drawingml/2006/main">
+              <a:graphicData uri="http://schemas.openxmlformats.org/drawingml/2006/picture">
+                <pic:pic xmlns:pic="http://schemas.openxmlformats.org/drawingml/2006/picture">
+                  <pic:nvPicPr>
+                    <pic:cNvPr id="1698279486" name="Imagen 1" descr="Interfaz de usuario gráfica&#10;&#10;El contenido generado por IA puede ser incorrecto."/>
+                    <pic:cNvPicPr/>
+                  </pic:nvPicPr>
+                  <pic:blipFill>
+                    <a:blip r:embed="rId7"/>
+                    <a:stretch>
+                      <a:fillRect/>
+                    </a:stretch>
+                  </pic:blipFill>
+                  <pic:spPr>
+                    <a:xfrm>
+                      <a:off x="0" y="0"/>
+                      <a:ext cx="5914124" cy="2763003"/>
+                    </a:xfrm>
+                    <a:prstGeom prst="rect">
+                      <a:avLst/>
+                    </a:prstGeom>
+                  </pic:spPr>
+                </pic:pic>
+              </a:graphicData>
+            </a:graphic>
+          </wp:inline>
+        </w:drawing>
+      </w:r>
+    </w:p>
+    <w:p>
+      <w:r>
+        <w:t>-FFT process:</w:t>
+      </w:r>
+    </w:p>
+    <w:p>
+      <w:r>
+        <w:rPr>
+          <w:noProof/>
+        </w:rPr>
+        <w:lastRenderedPageBreak/>
+        <w:drawing>
+          <wp:inline distT="0" distB="0" distL="0" distR="0" wp14:anchorId="45FB1D98" wp14:editId="5911B8ED">
+            <wp:extent cx="6030266" cy="3419061"/>
+            <wp:effectExtent l="0" t="0" r="8890" b="0"/>
+            <wp:docPr id="513766431" name="Imagen 1" descr="Imagen que contiene Gráfico&#10;&#10;El contenido generado por IA puede ser incorrecto."/>
+            <wp:cNvGraphicFramePr>
+              <a:graphicFrameLocks xmlns:a="http://schemas.openxmlformats.org/drawingml/2006/main" noChangeAspect="1"/>
+            </wp:cNvGraphicFramePr>
+            <a:graphic xmlns:a="http://schemas.openxmlformats.org/drawingml/2006/main">
+              <a:graphicData uri="http://schemas.openxmlformats.org/drawingml/2006/picture">
+                <pic:pic xmlns:pic="http://schemas.openxmlformats.org/drawingml/2006/picture">
+                  <pic:nvPicPr>
+                    <pic:cNvPr id="513766431" name="Imagen 1" descr="Imagen que contiene Gráfico&#10;&#10;El contenido generado por IA puede ser incorrecto."/>
+                    <pic:cNvPicPr/>
+                  </pic:nvPicPr>
+                  <pic:blipFill>
+                    <a:blip r:embed="rId8"/>
+                    <a:stretch>
+                      <a:fillRect/>
+                    </a:stretch>
+                  </pic:blipFill>
+                  <pic:spPr>
+                    <a:xfrm>
+                      <a:off x="0" y="0"/>
+                      <a:ext cx="6036376" cy="3422525"/>
+                    </a:xfrm>
+                    <a:prstGeom prst="rect">
+                      <a:avLst/>
+                    </a:prstGeom>
+                  </pic:spPr>
+                </pic:pic>
+              </a:graphicData>
+            </a:graphic>
+          </wp:inline>
+        </w:drawing>
+      </w:r>
+    </w:p>
+    <w:p/>
+    <w:p/>
+    <w:p>
+      <w:pPr>
+        <w:rPr>
+          <w:b/>
+          <w:bCs/>
+          <w:sz w:val="24"/>
+          <w:szCs w:val="24"/>
+        </w:rPr>
+      </w:pPr>
+      <w:r>
+        <w:rPr>
+          <w:b/>
+          <w:bCs/>
+          <w:sz w:val="24"/>
+          <w:szCs w:val="24"/>
+        </w:rPr>
+        <w:t>Oscar’s voice</w:t>
+      </w:r>
+      <w:r>
+        <w:rPr>
+          <w:b/>
+          <w:bCs/>
+          <w:sz w:val="24"/>
+          <w:szCs w:val="24"/>
+        </w:rPr>
+        <w:t xml:space="preserve"> test</w:t>
+      </w:r>
+    </w:p>
+    <w:p>
+      <w:r>
+        <w:t>-Audio captured from CODEC:</w:t>
+      </w:r>
+    </w:p>
+    <w:p>
+      <w:r>
+        <w:rPr>
+          <w:noProof/>
+        </w:rPr>
+        <w:drawing>
+          <wp:inline distT="0" distB="0" distL="0" distR="0" wp14:anchorId="139B1D79" wp14:editId="0A1B99C6">
+            <wp:extent cx="6097496" cy="2862470"/>
+            <wp:effectExtent l="0" t="0" r="0" b="0"/>
+            <wp:docPr id="1916107127" name="Imagen 1" descr="Gráfico, Gráfico de cajas y bigotes&#10;&#10;El contenido generado por IA puede ser incorrecto."/>
+            <wp:cNvGraphicFramePr>
+              <a:graphicFrameLocks xmlns:a="http://schemas.openxmlformats.org/drawingml/2006/main" noChangeAspect="1"/>
+            </wp:cNvGraphicFramePr>
+            <a:graphic xmlns:a="http://schemas.openxmlformats.org/drawingml/2006/main">
+              <a:graphicData uri="http://schemas.openxmlformats.org/drawingml/2006/picture">
+                <pic:pic xmlns:pic="http://schemas.openxmlformats.org/drawingml/2006/picture">
+                  <pic:nvPicPr>
+                    <pic:cNvPr id="1916107127" name="Imagen 1" descr="Gráfico, Gráfico de cajas y bigotes&#10;&#10;El contenido generado por IA puede ser incorrecto."/>
+                    <pic:cNvPicPr/>
+                  </pic:nvPicPr>
+                  <pic:blipFill>
+                    <a:blip r:embed="rId9"/>
+                    <a:stretch>
+                      <a:fillRect/>
+                    </a:stretch>
+                  </pic:blipFill>
+                  <pic:spPr>
+                    <a:xfrm>
+                      <a:off x="0" y="0"/>
+                      <a:ext cx="6104689" cy="2865847"/>
+                    </a:xfrm>
+                    <a:prstGeom prst="rect">
+                      <a:avLst/>
+                    </a:prstGeom>
+                  </pic:spPr>
+                </pic:pic>
+              </a:graphicData>
+            </a:graphic>
+          </wp:inline>
+        </w:drawing>
+      </w:r>
+    </w:p>
+    <w:p>
+      <w:r>
+        <w:t>-FFT process:</w:t>
+      </w:r>
+    </w:p>
+    <w:p>
+      <w:r>
+        <w:rPr>
+          <w:noProof/>
+        </w:rPr>
+        <w:lastRenderedPageBreak/>
+        <w:drawing>
+          <wp:inline distT="0" distB="0" distL="0" distR="0" wp14:anchorId="7A77C9E8" wp14:editId="454922B7">
+            <wp:extent cx="5963479" cy="3379845"/>
+            <wp:effectExtent l="0" t="0" r="0" b="0"/>
+            <wp:docPr id="981978416" name="Imagen 1" descr="Gráfico, Histograma&#10;&#10;El contenido generado por IA puede ser incorrecto."/>
+            <wp:cNvGraphicFramePr>
+              <a:graphicFrameLocks xmlns:a="http://schemas.openxmlformats.org/drawingml/2006/main" noChangeAspect="1"/>
+            </wp:cNvGraphicFramePr>
+            <a:graphic xmlns:a="http://schemas.openxmlformats.org/drawingml/2006/main">
+              <a:graphicData uri="http://schemas.openxmlformats.org/drawingml/2006/picture">
+                <pic:pic xmlns:pic="http://schemas.openxmlformats.org/drawingml/2006/picture">
+                  <pic:nvPicPr>
+                    <pic:cNvPr id="981978416" name="Imagen 1" descr="Gráfico, Histograma&#10;&#10;El contenido generado por IA puede ser incorrecto."/>
+                    <pic:cNvPicPr/>
+                  </pic:nvPicPr>
+                  <pic:blipFill>
+                    <a:blip r:embed="rId10"/>
+                    <a:stretch>
+                      <a:fillRect/>
+                    </a:stretch>
+                  </pic:blipFill>
+                  <pic:spPr>
+                    <a:xfrm>
+                      <a:off x="0" y="0"/>
+                      <a:ext cx="5969283" cy="3383134"/>
+                    </a:xfrm>
+                    <a:prstGeom prst="rect">
+                      <a:avLst/>
+                    </a:prstGeom>
+                  </pic:spPr>
+                </pic:pic>
+              </a:graphicData>
+            </a:graphic>
+          </wp:inline>
+        </w:drawing>
+      </w:r>
+    </w:p>
+    <w:p/>
+    <w:p/>
+    <w:p>
+      <w:pPr>
+        <w:rPr>
+          <w:b/>
+          <w:bCs/>
+          <w:sz w:val="24"/>
+          <w:szCs w:val="24"/>
+        </w:rPr>
+      </w:pPr>
+      <w:r>
+        <w:rPr>
+          <w:b/>
+          <w:bCs/>
+          <w:sz w:val="24"/>
+          <w:szCs w:val="24"/>
+        </w:rPr>
+        <w:t>David’s voice</w:t>
+      </w:r>
+      <w:r>
+        <w:rPr>
+          <w:b/>
+          <w:bCs/>
+          <w:sz w:val="24"/>
+          <w:szCs w:val="24"/>
+        </w:rPr>
+        <w:t xml:space="preserve"> test</w:t>
+      </w:r>
+    </w:p>
+    <w:p>
+      <w:r>
+        <w:t>-Audio captured from CODEC:</w:t>
+      </w:r>
+    </w:p>
+    <w:p>
+      <w:r>
+        <w:rPr>
+          <w:noProof/>
+        </w:rPr>
+        <w:drawing>
+          <wp:inline distT="0" distB="0" distL="0" distR="0" wp14:anchorId="6C175EFA" wp14:editId="2B3977C2">
+            <wp:extent cx="5979647" cy="2790908"/>
+            <wp:effectExtent l="0" t="0" r="2540" b="0"/>
+            <wp:docPr id="1605512681" name="Imagen 1" descr="Gráfico, Gráfico de dispersión&#10;&#10;El contenido generado por IA puede ser incorrecto."/>
+            <wp:cNvGraphicFramePr>
+              <a:graphicFrameLocks xmlns:a="http://schemas.openxmlformats.org/drawingml/2006/main" noChangeAspect="1"/>
+            </wp:cNvGraphicFramePr>
+            <a:graphic xmlns:a="http://schemas.openxmlformats.org/drawingml/2006/main">
+              <a:graphicData uri="http://schemas.openxmlformats.org/drawingml/2006/picture">
+                <pic:pic xmlns:pic="http://schemas.openxmlformats.org/drawingml/2006/picture">
+                  <pic:nvPicPr>
+                    <pic:cNvPr id="1605512681" name="Imagen 1" descr="Gráfico, Gráfico de dispersión&#10;&#10;El contenido generado por IA puede ser incorrecto."/>
+                    <pic:cNvPicPr/>
+                  </pic:nvPicPr>
+                  <pic:blipFill>
+                    <a:blip r:embed="rId11"/>
+                    <a:stretch>
+                      <a:fillRect/>
+                    </a:stretch>
+                  </pic:blipFill>
+                  <pic:spPr>
+                    <a:xfrm>
+                      <a:off x="0" y="0"/>
+                      <a:ext cx="5986053" cy="2793898"/>
+                    </a:xfrm>
+                    <a:prstGeom prst="rect">
+                      <a:avLst/>
+                    </a:prstGeom>
+                  </pic:spPr>
+                </pic:pic>
+              </a:graphicData>
+            </a:graphic>
+          </wp:inline>
+        </w:drawing>
+      </w:r>
+    </w:p>
+    <w:p>
+      <w:r>
+        <w:t>-FFT process:</w:t>
+      </w:r>
+    </w:p>
+    <w:p>
+      <w:r>
+        <w:rPr>
+          <w:noProof/>
+        </w:rPr>
+        <w:lastRenderedPageBreak/>
+        <w:drawing>
+          <wp:inline distT="0" distB="0" distL="0" distR="0" wp14:anchorId="2C7AF9E9" wp14:editId="5F683CDA">
+            <wp:extent cx="6090662" cy="3458818"/>
+            <wp:effectExtent l="0" t="0" r="5715" b="8890"/>
+            <wp:docPr id="1835176488" name="Imagen 1" descr="Gráfico, Histograma&#10;&#10;El contenido generado por IA puede ser incorrecto."/>
+            <wp:cNvGraphicFramePr>
+              <a:graphicFrameLocks xmlns:a="http://schemas.openxmlformats.org/drawingml/2006/main" noChangeAspect="1"/>
+            </wp:cNvGraphicFramePr>
+            <a:graphic xmlns:a="http://schemas.openxmlformats.org/drawingml/2006/main">
+              <a:graphicData uri="http://schemas.openxmlformats.org/drawingml/2006/picture">
+                <pic:pic xmlns:pic="http://schemas.openxmlformats.org/drawingml/2006/picture">
+                  <pic:nvPicPr>
+                    <pic:cNvPr id="1835176488" name="Imagen 1" descr="Gráfico, Histograma&#10;&#10;El contenido generado por IA puede ser incorrecto."/>
+                    <pic:cNvPicPr/>
+                  </pic:nvPicPr>
+                  <pic:blipFill>
+                    <a:blip r:embed="rId12"/>
+                    <a:stretch>
+                      <a:fillRect/>
+                    </a:stretch>
+                  </pic:blipFill>
+                  <pic:spPr>
+                    <a:xfrm>
+                      <a:off x="0" y="0"/>
+                      <a:ext cx="6098262" cy="3463134"/>
+                    </a:xfrm>
+                    <a:prstGeom prst="rect">
+                      <a:avLst/>
+                    </a:prstGeom>
+                  </pic:spPr>
+                </pic:pic>
+              </a:graphicData>
+            </a:graphic>
+          </wp:inline>
+        </w:drawing>
       </w:r>
     </w:p>
     <w:p/>
@@ -594,6 +1081,10 @@
   <w:style w:type="paragraph" w:default="1" w:styleId="Normal">
     <w:name w:val="Normal"/>
     <w:qFormat/>
+    <w:rsid w:val="00DF4CA7"/>
+    <w:rPr>
+      <w:lang w:val="en-US"/>
+    </w:rPr>
   </w:style>
   <w:style w:type="paragraph" w:styleId="Ttulo1">
     <w:name w:val="heading 1"/>
@@ -797,6 +1288,7 @@
   <w:style w:type="character" w:default="1" w:styleId="Fuentedeprrafopredeter">
     <w:name w:val="Default Paragraph Font"/>
     <w:uiPriority w:val="1"/>
+    <w:semiHidden/>
     <w:unhideWhenUsed/>
   </w:style>
   <w:style w:type="table" w:default="1" w:styleId="Tablanormal">

</xml_diff>

<commit_message>
Adding CODEC data sheet
</commit_message>
<xml_diff>
--- a/SAMV71x/project_FFT/Project_FFT.docx
+++ b/SAMV71x/project_FFT/Project_FFT.docx
@@ -1,6 +1,6 @@
 
 <file path=word/document.xml><?xml version="1.0" encoding="utf-8"?>
-<w:document xmlns:wpc="http://schemas.microsoft.com/office/word/2010/wordprocessingCanvas" xmlns:cx="http://schemas.microsoft.com/office/drawing/2014/chartex" xmlns:cx1="http://schemas.microsoft.com/office/drawing/2015/9/8/chartex" xmlns:cx2="http://schemas.microsoft.com/office/drawing/2015/10/21/chartex" xmlns:cx3="http://schemas.microsoft.com/office/drawing/2016/5/9/chartex" xmlns:cx4="http://schemas.microsoft.com/office/drawing/2016/5/10/chartex" xmlns:cx5="http://schemas.microsoft.com/office/drawing/2016/5/11/chartex" xmlns:cx6="http://schemas.microsoft.com/office/drawing/2016/5/12/chartex" xmlns:cx7="http://schemas.microsoft.com/office/drawing/2016/5/13/chartex" xmlns:cx8="http://schemas.microsoft.com/office/drawing/2016/5/14/chartex" xmlns:mc="http://schemas.openxmlformats.org/markup-compatibility/2006" xmlns:aink="http://schemas.microsoft.com/office/drawing/2016/ink" xmlns:am3d="http://schemas.microsoft.com/office/drawing/2017/model3d" xmlns:o="urn:schemas-microsoft-com:office:office" xmlns:oel="http://schemas.microsoft.com/office/2019/extlst" xmlns:r="http://schemas.openxmlformats.org/officeDocument/2006/relationships" xmlns:m="http://schemas.openxmlformats.org/officeDocument/2006/math" xmlns:v="urn:schemas-microsoft-com:vml" xmlns:wp14="http://schemas.microsoft.com/office/word/2010/wordprocessingDrawing" xmlns:wp="http://schemas.openxmlformats.org/drawingml/2006/wordprocessingDrawing" xmlns:w10="urn:schemas-microsoft-com:office:word" xmlns:w="http://schemas.openxmlformats.org/wordprocessingml/2006/main" xmlns:w14="http://schemas.microsoft.com/office/word/2010/wordml" xmlns:w15="http://schemas.microsoft.com/office/word/2012/wordml" xmlns:w16cex="http://schemas.microsoft.com/office/word/2018/wordml/cex" xmlns:w16cid="http://schemas.microsoft.com/office/word/2016/wordml/cid" xmlns:w16="http://schemas.microsoft.com/office/word/2018/wordml" xmlns:w16du="http://schemas.microsoft.com/office/word/2023/wordml/word16du" xmlns:w16sdtdh="http://schemas.microsoft.com/office/word/2020/wordml/sdtdatahash" xmlns:w16sdtfl="http://schemas.microsoft.com/office/word/2024/wordml/sdtformatlock" xmlns:w16se="http://schemas.microsoft.com/office/word/2015/wordml/symex" xmlns:wpg="http://schemas.microsoft.com/office/word/2010/wordprocessingGroup" xmlns:wpi="http://schemas.microsoft.com/office/word/2010/wordprocessingInk" xmlns:wne="http://schemas.microsoft.com/office/word/2006/wordml" xmlns:wps="http://schemas.microsoft.com/office/word/2010/wordprocessingShape" mc:Ignorable="w14 w15 w16se w16cid w16 w16cex w16sdtdh w16sdtfl w16du wp14">
+<w:document xmlns:wpc="http://schemas.microsoft.com/office/word/2010/wordprocessingCanvas" xmlns:cx="http://schemas.microsoft.com/office/drawing/2014/chartex" xmlns:cx1="http://schemas.microsoft.com/office/drawing/2015/9/8/chartex" xmlns:mc="http://schemas.openxmlformats.org/markup-compatibility/2006" xmlns:o="urn:schemas-microsoft-com:office:office" xmlns:r="http://schemas.openxmlformats.org/officeDocument/2006/relationships" xmlns:m="http://schemas.openxmlformats.org/officeDocument/2006/math" xmlns:v="urn:schemas-microsoft-com:vml" xmlns:wp14="http://schemas.microsoft.com/office/word/2010/wordprocessingDrawing" xmlns:wp="http://schemas.openxmlformats.org/drawingml/2006/wordprocessingDrawing" xmlns:w10="urn:schemas-microsoft-com:office:word" xmlns:w="http://schemas.openxmlformats.org/wordprocessingml/2006/main" xmlns:w14="http://schemas.microsoft.com/office/word/2010/wordml" xmlns:w15="http://schemas.microsoft.com/office/word/2012/wordml" xmlns:w16se="http://schemas.microsoft.com/office/word/2015/wordml/symex" xmlns:wpg="http://schemas.microsoft.com/office/word/2010/wordprocessingGroup" xmlns:wpi="http://schemas.microsoft.com/office/word/2010/wordprocessingInk" xmlns:wne="http://schemas.microsoft.com/office/word/2006/wordml" xmlns:wps="http://schemas.microsoft.com/office/word/2010/wordprocessingShape" mc:Ignorable="w14 w15 w16se wp14">
   <w:body>
     <w:p>
       <w:pPr>
@@ -48,6 +48,32 @@
       </w:r>
     </w:p>
     <w:p/>
+    <w:p>
+      <w:pPr>
+        <w:rPr>
+          <w:b/>
+        </w:rPr>
+      </w:pPr>
+      <w:r>
+        <w:rPr>
+          <w:b/>
+        </w:rPr>
+        <w:t>CODEC I2S config:</w:t>
+      </w:r>
+    </w:p>
+    <w:p>
+      <w:r>
+        <w:t>CODEC was configured with a fs of 8Khz and SCK of 512Khz</w:t>
+      </w:r>
+      <w:r>
+        <w:t xml:space="preserve"> with data word of 4 bytes</w:t>
+      </w:r>
+      <w:bookmarkStart w:id="0" w:name="_GoBack"/>
+      <w:bookmarkEnd w:id="0"/>
+      <w:r>
+        <w:t xml:space="preserve"> for capturing voice, only the left channel is used due to RAM limitations ( just 8s can be captured ).</w:t>
+      </w:r>
+    </w:p>
     <w:p/>
     <w:p>
       <w:pPr>
@@ -86,6 +112,7 @@
       <w:r>
         <w:rPr>
           <w:noProof/>
+          <w:lang w:val="es-MX" w:eastAsia="es-MX"/>
         </w:rPr>
         <w:drawing>
           <wp:inline distT="0" distB="0" distL="0" distR="0" wp14:anchorId="4E676D1C" wp14:editId="4F60AD00">
@@ -134,6 +161,7 @@
       <w:r>
         <w:rPr>
           <w:noProof/>
+          <w:lang w:val="es-MX" w:eastAsia="es-MX"/>
         </w:rPr>
         <w:lastRenderedPageBreak/>
         <w:drawing>
@@ -213,6 +241,7 @@
       <w:r>
         <w:rPr>
           <w:noProof/>
+          <w:lang w:val="es-MX" w:eastAsia="es-MX"/>
         </w:rPr>
         <w:drawing>
           <wp:inline distT="0" distB="0" distL="0" distR="0" wp14:anchorId="4993D261" wp14:editId="29E49D96">
@@ -260,6 +289,7 @@
       <w:r>
         <w:rPr>
           <w:noProof/>
+          <w:lang w:val="es-MX" w:eastAsia="es-MX"/>
         </w:rPr>
         <w:lastRenderedPageBreak/>
         <w:drawing>
@@ -338,6 +368,7 @@
       <w:r>
         <w:rPr>
           <w:noProof/>
+          <w:lang w:val="es-MX" w:eastAsia="es-MX"/>
         </w:rPr>
         <w:drawing>
           <wp:inline distT="0" distB="0" distL="0" distR="0" wp14:anchorId="139B1D79" wp14:editId="0A1B99C6">
@@ -385,6 +416,7 @@
       <w:r>
         <w:rPr>
           <w:noProof/>
+          <w:lang w:val="es-MX" w:eastAsia="es-MX"/>
         </w:rPr>
         <w:lastRenderedPageBreak/>
         <w:drawing>
@@ -463,6 +495,7 @@
       <w:r>
         <w:rPr>
           <w:noProof/>
+          <w:lang w:val="es-MX" w:eastAsia="es-MX"/>
         </w:rPr>
         <w:drawing>
           <wp:inline distT="0" distB="0" distL="0" distR="0" wp14:anchorId="6C175EFA" wp14:editId="2B3977C2">
@@ -510,6 +543,7 @@
       <w:r>
         <w:rPr>
           <w:noProof/>
+          <w:lang w:val="es-MX" w:eastAsia="es-MX"/>
         </w:rPr>
         <w:lastRenderedPageBreak/>
         <w:drawing>
@@ -561,7 +595,7 @@
 </file>
 
 <file path=word/numbering.xml><?xml version="1.0" encoding="utf-8"?>
-<w:numbering xmlns:wpc="http://schemas.microsoft.com/office/word/2010/wordprocessingCanvas" xmlns:cx="http://schemas.microsoft.com/office/drawing/2014/chartex" xmlns:cx1="http://schemas.microsoft.com/office/drawing/2015/9/8/chartex" xmlns:cx2="http://schemas.microsoft.com/office/drawing/2015/10/21/chartex" xmlns:cx3="http://schemas.microsoft.com/office/drawing/2016/5/9/chartex" xmlns:cx4="http://schemas.microsoft.com/office/drawing/2016/5/10/chartex" xmlns:cx5="http://schemas.microsoft.com/office/drawing/2016/5/11/chartex" xmlns:cx6="http://schemas.microsoft.com/office/drawing/2016/5/12/chartex" xmlns:cx7="http://schemas.microsoft.com/office/drawing/2016/5/13/chartex" xmlns:cx8="http://schemas.microsoft.com/office/drawing/2016/5/14/chartex" xmlns:mc="http://schemas.openxmlformats.org/markup-compatibility/2006" xmlns:aink="http://schemas.microsoft.com/office/drawing/2016/ink" xmlns:am3d="http://schemas.microsoft.com/office/drawing/2017/model3d" xmlns:o="urn:schemas-microsoft-com:office:office" xmlns:oel="http://schemas.microsoft.com/office/2019/extlst" xmlns:r="http://schemas.openxmlformats.org/officeDocument/2006/relationships" xmlns:m="http://schemas.openxmlformats.org/officeDocument/2006/math" xmlns:v="urn:schemas-microsoft-com:vml" xmlns:wp14="http://schemas.microsoft.com/office/word/2010/wordprocessingDrawing" xmlns:wp="http://schemas.openxmlformats.org/drawingml/2006/wordprocessingDrawing" xmlns:w10="urn:schemas-microsoft-com:office:word" xmlns:w="http://schemas.openxmlformats.org/wordprocessingml/2006/main" xmlns:w14="http://schemas.microsoft.com/office/word/2010/wordml" xmlns:w15="http://schemas.microsoft.com/office/word/2012/wordml" xmlns:w16cex="http://schemas.microsoft.com/office/word/2018/wordml/cex" xmlns:w16cid="http://schemas.microsoft.com/office/word/2016/wordml/cid" xmlns:w16="http://schemas.microsoft.com/office/word/2018/wordml" xmlns:w16du="http://schemas.microsoft.com/office/word/2023/wordml/word16du" xmlns:w16sdtdh="http://schemas.microsoft.com/office/word/2020/wordml/sdtdatahash" xmlns:w16sdtfl="http://schemas.microsoft.com/office/word/2024/wordml/sdtformatlock" xmlns:w16se="http://schemas.microsoft.com/office/word/2015/wordml/symex" xmlns:wpg="http://schemas.microsoft.com/office/word/2010/wordprocessingGroup" xmlns:wpi="http://schemas.microsoft.com/office/word/2010/wordprocessingInk" xmlns:wne="http://schemas.microsoft.com/office/word/2006/wordml" xmlns:wps="http://schemas.microsoft.com/office/word/2010/wordprocessingShape" mc:Ignorable="w14 w15 w16se w16cid w16 w16cex w16sdtdh w16sdtfl w16du wp14">
+<w:numbering xmlns:wpc="http://schemas.microsoft.com/office/word/2010/wordprocessingCanvas" xmlns:cx="http://schemas.microsoft.com/office/drawing/2014/chartex" xmlns:cx1="http://schemas.microsoft.com/office/drawing/2015/9/8/chartex" xmlns:mc="http://schemas.openxmlformats.org/markup-compatibility/2006" xmlns:o="urn:schemas-microsoft-com:office:office" xmlns:r="http://schemas.openxmlformats.org/officeDocument/2006/relationships" xmlns:m="http://schemas.openxmlformats.org/officeDocument/2006/math" xmlns:v="urn:schemas-microsoft-com:vml" xmlns:wp14="http://schemas.microsoft.com/office/word/2010/wordprocessingDrawing" xmlns:wp="http://schemas.openxmlformats.org/drawingml/2006/wordprocessingDrawing" xmlns:w10="urn:schemas-microsoft-com:office:word" xmlns:w="http://schemas.openxmlformats.org/wordprocessingml/2006/main" xmlns:w14="http://schemas.microsoft.com/office/word/2010/wordml" xmlns:w15="http://schemas.microsoft.com/office/word/2012/wordml" xmlns:w16se="http://schemas.microsoft.com/office/word/2015/wordml/symex" xmlns:wpg="http://schemas.microsoft.com/office/word/2010/wordprocessingGroup" xmlns:wpi="http://schemas.microsoft.com/office/word/2010/wordprocessingInk" xmlns:wne="http://schemas.microsoft.com/office/word/2006/wordml" xmlns:wps="http://schemas.microsoft.com/office/word/2010/wordprocessingShape" mc:Ignorable="w14 w15 w16se wp14">
   <w:abstractNum w:abstractNumId="0" w15:restartNumberingAfterBreak="0">
     <w:nsid w:val="5BAF2078"/>
     <w:multiLevelType w:val="hybridMultilevel"/>
@@ -675,14 +709,14 @@
       </w:rPr>
     </w:lvl>
   </w:abstractNum>
-  <w:num w:numId="1" w16cid:durableId="2107268944">
+  <w:num w:numId="1">
     <w:abstractNumId w:val="0"/>
   </w:num>
 </w:numbering>
 </file>
 
 <file path=word/styles.xml><?xml version="1.0" encoding="utf-8"?>
-<w:styles xmlns:mc="http://schemas.openxmlformats.org/markup-compatibility/2006" xmlns:r="http://schemas.openxmlformats.org/officeDocument/2006/relationships" xmlns:w="http://schemas.openxmlformats.org/wordprocessingml/2006/main" xmlns:w14="http://schemas.microsoft.com/office/word/2010/wordml" xmlns:w15="http://schemas.microsoft.com/office/word/2012/wordml" xmlns:w16cex="http://schemas.microsoft.com/office/word/2018/wordml/cex" xmlns:w16cid="http://schemas.microsoft.com/office/word/2016/wordml/cid" xmlns:w16="http://schemas.microsoft.com/office/word/2018/wordml" xmlns:w16du="http://schemas.microsoft.com/office/word/2023/wordml/word16du" xmlns:w16sdtdh="http://schemas.microsoft.com/office/word/2020/wordml/sdtdatahash" xmlns:w16sdtfl="http://schemas.microsoft.com/office/word/2024/wordml/sdtformatlock" xmlns:w16se="http://schemas.microsoft.com/office/word/2015/wordml/symex" mc:Ignorable="w14 w15 w16se w16cid w16 w16cex w16sdtdh w16sdtfl w16du">
+<w:styles xmlns:mc="http://schemas.openxmlformats.org/markup-compatibility/2006" xmlns:r="http://schemas.openxmlformats.org/officeDocument/2006/relationships" xmlns:w="http://schemas.openxmlformats.org/wordprocessingml/2006/main" xmlns:w14="http://schemas.microsoft.com/office/word/2010/wordml" xmlns:w15="http://schemas.microsoft.com/office/word/2012/wordml" xmlns:w16se="http://schemas.microsoft.com/office/word/2015/wordml/symex" mc:Ignorable="w14 w15 w16se">
   <w:docDefaults>
     <w:rPrDefault>
       <w:rPr>
@@ -700,7 +734,7 @@
       </w:pPr>
     </w:pPrDefault>
   </w:docDefaults>
-  <w:latentStyles w:defLockedState="0" w:defUIPriority="99" w:defSemiHidden="0" w:defUnhideWhenUsed="0" w:defQFormat="0" w:count="376">
+  <w:latentStyles w:defLockedState="0" w:defUIPriority="99" w:defSemiHidden="0" w:defUnhideWhenUsed="0" w:defQFormat="0" w:count="371">
     <w:lsdException w:name="Normal" w:uiPriority="0" w:qFormat="1"/>
     <w:lsdException w:name="heading 1" w:uiPriority="9" w:qFormat="1"/>
     <w:lsdException w:name="heading 2" w:semiHidden="1" w:uiPriority="9" w:unhideWhenUsed="1" w:qFormat="1"/>
@@ -1072,11 +1106,6 @@
     <w:lsdException w:name="List Table 5 Dark Accent 6" w:uiPriority="50"/>
     <w:lsdException w:name="List Table 6 Colorful Accent 6" w:uiPriority="51"/>
     <w:lsdException w:name="List Table 7 Colorful Accent 6" w:uiPriority="52"/>
-    <w:lsdException w:name="Mention" w:semiHidden="1" w:unhideWhenUsed="1"/>
-    <w:lsdException w:name="Smart Hyperlink" w:semiHidden="1" w:unhideWhenUsed="1"/>
-    <w:lsdException w:name="Hashtag" w:semiHidden="1" w:unhideWhenUsed="1"/>
-    <w:lsdException w:name="Unresolved Mention" w:semiHidden="1" w:unhideWhenUsed="1"/>
-    <w:lsdException w:name="Smart Link" w:semiHidden="1" w:unhideWhenUsed="1"/>
   </w:latentStyles>
   <w:style w:type="paragraph" w:default="1" w:styleId="Normal">
     <w:name w:val="Normal"/>

</xml_diff>

<commit_message>
Adding Repo link to report
</commit_message>
<xml_diff>
--- a/SAMV71x/project_FFT/Project_FFT.docx
+++ b/SAMV71x/project_FFT/Project_FFT.docx
@@ -47,7 +47,6 @@
         <w:t>David Michel</w:t>
       </w:r>
     </w:p>
-    <w:p/>
     <w:p>
       <w:pPr>
         <w:rPr>
@@ -58,18 +57,68 @@
         <w:rPr>
           <w:b/>
         </w:rPr>
-        <w:t>CODEC I2S config:</w:t>
-      </w:r>
-    </w:p>
-    <w:p>
-      <w:r>
-        <w:t>CODEC was configured with a fs of 8Khz and SCK of 512Khz</w:t>
-      </w:r>
-      <w:r>
-        <w:t xml:space="preserve"> with data word of 4 bytes</w:t>
-      </w:r>
+        <w:t>REPO link:</w:t>
+      </w:r>
+    </w:p>
+    <w:p>
+      <w:pPr>
+        <w:rPr>
+          <w:b/>
+        </w:rPr>
+      </w:pPr>
+      <w:hyperlink r:id="rId5" w:history="1">
+        <w:r>
+          <w:rPr>
+            <w:rStyle w:val="Hipervnculo"/>
+            <w:b/>
+          </w:rPr>
+          <w:t>https://github.com/OscarM-Dev/ATSAMV71-XULT_Sandbox/tree/Project_5_FFT_Audio</w:t>
+        </w:r>
+      </w:hyperlink>
+    </w:p>
+    <w:p>
+      <w:pPr>
+        <w:rPr>
+          <w:b/>
+        </w:rPr>
+      </w:pPr>
       <w:bookmarkStart w:id="0" w:name="_GoBack"/>
       <w:bookmarkEnd w:id="0"/>
+    </w:p>
+    <w:p>
+      <w:pPr>
+        <w:rPr>
+          <w:b/>
+        </w:rPr>
+      </w:pPr>
+      <w:r>
+        <w:rPr>
+          <w:b/>
+        </w:rPr>
+        <w:t xml:space="preserve">CODEC I2S </w:t>
+      </w:r>
+      <w:proofErr w:type="spellStart"/>
+      <w:r>
+        <w:rPr>
+          <w:b/>
+        </w:rPr>
+        <w:t>config</w:t>
+      </w:r>
+      <w:proofErr w:type="spellEnd"/>
+      <w:r>
+        <w:rPr>
+          <w:b/>
+        </w:rPr>
+        <w:t>:</w:t>
+      </w:r>
+    </w:p>
+    <w:p>
+      <w:r>
+        <w:t>CODEC was configured with a fs of 8Khz and SCK of 512Khz</w:t>
+      </w:r>
+      <w:r>
+        <w:t xml:space="preserve"> with data word of 4 bytes</w:t>
+      </w:r>
       <w:r>
         <w:t xml:space="preserve"> for capturing voice, only the left channel is used due to RAM limitations ( just 8s can be captured ).</w:t>
       </w:r>
@@ -84,6 +133,7 @@
           <w:szCs w:val="24"/>
         </w:rPr>
       </w:pPr>
+      <w:proofErr w:type="gramStart"/>
       <w:r>
         <w:rPr>
           <w:b/>
@@ -91,7 +141,17 @@
           <w:sz w:val="24"/>
           <w:szCs w:val="24"/>
         </w:rPr>
-        <w:t xml:space="preserve">1kHz </w:t>
+        <w:t>1kHz</w:t>
+      </w:r>
+      <w:proofErr w:type="gramEnd"/>
+      <w:r>
+        <w:rPr>
+          <w:b/>
+          <w:bCs/>
+          <w:sz w:val="24"/>
+          <w:szCs w:val="24"/>
+        </w:rPr>
+        <w:t xml:space="preserve"> </w:t>
       </w:r>
       <w:r>
         <w:rPr>
@@ -130,7 +190,7 @@
                     <pic:cNvPicPr/>
                   </pic:nvPicPr>
                   <pic:blipFill>
-                    <a:blip r:embed="rId5"/>
+                    <a:blip r:embed="rId6"/>
                     <a:stretch>
                       <a:fillRect/>
                     </a:stretch>
@@ -180,7 +240,7 @@
                     <pic:cNvPicPr/>
                   </pic:nvPicPr>
                   <pic:blipFill>
-                    <a:blip r:embed="rId6"/>
+                    <a:blip r:embed="rId7"/>
                     <a:stretch>
                       <a:fillRect/>
                     </a:stretch>
@@ -213,6 +273,7 @@
           <w:szCs w:val="24"/>
         </w:rPr>
       </w:pPr>
+      <w:proofErr w:type="gramStart"/>
       <w:r>
         <w:rPr>
           <w:b/>
@@ -229,7 +290,17 @@
           <w:sz w:val="24"/>
           <w:szCs w:val="24"/>
         </w:rPr>
-        <w:t>kHz sine wave test</w:t>
+        <w:t>kHz</w:t>
+      </w:r>
+      <w:proofErr w:type="gramEnd"/>
+      <w:r>
+        <w:rPr>
+          <w:b/>
+          <w:bCs/>
+          <w:sz w:val="24"/>
+          <w:szCs w:val="24"/>
+        </w:rPr>
+        <w:t xml:space="preserve"> sine wave test</w:t>
       </w:r>
     </w:p>
     <w:p>
@@ -259,7 +330,7 @@
                     <pic:cNvPicPr/>
                   </pic:nvPicPr>
                   <pic:blipFill>
-                    <a:blip r:embed="rId7"/>
+                    <a:blip r:embed="rId8"/>
                     <a:stretch>
                       <a:fillRect/>
                     </a:stretch>
@@ -308,7 +379,7 @@
                     <pic:cNvPicPr/>
                   </pic:nvPicPr>
                   <pic:blipFill>
-                    <a:blip r:embed="rId8"/>
+                    <a:blip r:embed="rId9"/>
                     <a:stretch>
                       <a:fillRect/>
                     </a:stretch>
@@ -386,7 +457,7 @@
                     <pic:cNvPicPr/>
                   </pic:nvPicPr>
                   <pic:blipFill>
-                    <a:blip r:embed="rId9"/>
+                    <a:blip r:embed="rId10"/>
                     <a:stretch>
                       <a:fillRect/>
                     </a:stretch>
@@ -435,7 +506,7 @@
                     <pic:cNvPicPr/>
                   </pic:nvPicPr>
                   <pic:blipFill>
-                    <a:blip r:embed="rId10"/>
+                    <a:blip r:embed="rId11"/>
                     <a:stretch>
                       <a:fillRect/>
                     </a:stretch>
@@ -513,7 +584,7 @@
                     <pic:cNvPicPr/>
                   </pic:nvPicPr>
                   <pic:blipFill>
-                    <a:blip r:embed="rId11"/>
+                    <a:blip r:embed="rId12"/>
                     <a:stretch>
                       <a:fillRect/>
                     </a:stretch>
@@ -562,7 +633,7 @@
                     <pic:cNvPicPr/>
                   </pic:nvPicPr>
                   <pic:blipFill>
-                    <a:blip r:embed="rId12"/>
+                    <a:blip r:embed="rId13"/>
                     <a:stretch>
                       <a:fillRect/>
                     </a:stretch>
@@ -1631,6 +1702,17 @@
       <w:spacing w:val="5"/>
     </w:rPr>
   </w:style>
+  <w:style w:type="character" w:styleId="Hipervnculo">
+    <w:name w:val="Hyperlink"/>
+    <w:basedOn w:val="Fuentedeprrafopredeter"/>
+    <w:uiPriority w:val="99"/>
+    <w:unhideWhenUsed/>
+    <w:rsid w:val="000F0387"/>
+    <w:rPr>
+      <w:color w:val="467886" w:themeColor="hyperlink"/>
+      <w:u w:val="single"/>
+    </w:rPr>
+  </w:style>
 </w:styles>
 </file>
 

</xml_diff>